<commit_message>
Add Tom's Nigeria phone number to Katamkpe contact blocks, alongside wife's UK number
</commit_message>
<xml_diff>
--- a/documents_aug2026/katamkpe_project/KATAMKPE_FULL_BUYER_OUTREACH_PACKAGE.docx
+++ b/documents_aug2026/katamkpe_project/KATAMKPE_FULL_BUYER_OUTREACH_PACKAGE.docx
@@ -1023,7 +1023,7 @@
           <w:sz w:val="20"/>
           <w:szCs w:val="20"/>
         </w:rPr>
-        <w:t xml:space="preserve">Nigeria &amp; Local Abuja Inquiries: Email betoniqwestltd@gmail.com; Corporate Entity BETONIQ INVEST / BETONIQ WEST LTD (RC 1496603), Abuja, FCT, Nigeria.</w:t>
+        <w:t xml:space="preserve">Nigeria &amp; Local Abuja Inquiries: Phone/WhatsApp +234 706 525 2117 (Tom Ugbodaga, direct); Email betoniqwestltd@gmail.com; Corporate Entity BETONIQ INVEST / BETONIQ WEST LTD (RC 1496603), Abuja, FCT, Nigeria.</w:t>
       </w:r>
     </w:p>
     <w:p>
@@ -1942,6 +1942,23 @@
           <w:szCs w:val="26"/>
         </w:rPr>
         <w:t xml:space="preserve">Contact Details for the Listing</w:t>
+      </w:r>
+    </w:p>
+    <w:p>
+      <w:pPr>
+        <w:pStyle w:val="ListParagraph"/>
+        <w:numPr>
+          <w:ilvl w:val="0"/>
+          <w:numId w:val="1"/>
+        </w:numPr>
+        <w:spacing w:after="100"/>
+      </w:pPr>
+      <w:r>
+        <w:rPr>
+          <w:sz w:val="20"/>
+          <w:szCs w:val="20"/>
+        </w:rPr>
+        <w:t xml:space="preserve">Phone / WhatsApp (Nigeria): +234 706 525 2117 (Tom Ugbodaga, direct)</w:t>
       </w:r>
     </w:p>
     <w:p>

</xml_diff>